<commit_message>
Actualizar entregables con el diseno y funcionalidades actuales
- Capturas nuevas: Home, Estudiantes/Profesores (con columna Notas y menu de
  acciones), Notas (badge Aprobado/Reprobado), dialogo de creacion con
  Nombres/Apellidos, confirmacion y error con SweetAlert2, Swagger en ingles
- Documento de instalacion regenerado: instrucciones Docker y local, seccion
  de calidad de codigo/tests, decisiones de diseno actualizadas, autoria
- Script SQL regenerado en formato idempotente
</commit_message>
<xml_diff>
--- a/entregables/Documento_Instalacion.docx
+++ b/entregables/Documento_Instalacion.docx
@@ -4,7 +4,7 @@
   <w:body>
     <w:p>
       <w:pPr>
-        <w:spacing w:after="200" w:before="1200"/>
+        <w:spacing w:after="200" w:before="1000"/>
         <w:jc w:val="center"/>
       </w:pPr>
       <w:r>
@@ -33,7 +33,7 @@
     </w:p>
     <w:p>
       <w:pPr>
-        <w:spacing w:after="1600"/>
+        <w:spacing w:after="500"/>
         <w:jc w:val="center"/>
       </w:pPr>
       <w:r>
@@ -49,6 +49,22 @@
     </w:p>
     <w:p>
       <w:pPr>
+        <w:spacing w:after="900"/>
+        <w:jc w:val="center"/>
+      </w:pPr>
+      <w:r>
+        <w:rPr>
+          <w:b/>
+          <w:bCs/>
+          <w:color w:val="2E4374"/>
+          <w:sz w:val="26"/>
+          <w:szCs w:val="26"/>
+        </w:rPr>
+        <w:t xml:space="preserve">Desarrollado por: Anthony Daza</w:t>
+      </w:r>
+    </w:p>
+    <w:p>
+      <w:pPr>
         <w:spacing w:after="80"/>
         <w:jc w:val="center"/>
       </w:pPr>
@@ -57,7 +73,7 @@
           <w:sz w:val="22"/>
           <w:szCs w:val="22"/>
         </w:rPr>
-        <w:t xml:space="preserve">Stack: .NET 10 (Clean Architecture) + Angular (Material + Tailwind CSS) + SQL Server LocalDB</w:t>
+        <w:t xml:space="preserve">Stack: .NET 10 (Clean Architecture) + Angular (Material + Tailwind CSS + SweetAlert2) + SQL Server + Docker</w:t>
       </w:r>
     </w:p>
     <w:p>
@@ -118,7 +134,7 @@
         <w:spacing w:after="60"/>
       </w:pPr>
       <w:r>
-        <w:t xml:space="preserve">Cada acción de creación, edición y eliminación muestra un mensaje de confirmación explícito.</w:t>
+        <w:t xml:space="preserve">Cada acción de creación, edición y eliminación muestra un mensaje de confirmación explícito (SweetAlert2).</w:t>
       </w:r>
     </w:p>
     <w:p>
@@ -158,6 +174,14 @@
       </w:pPr>
       <w:r>
         <w:t xml:space="preserve">Se cuidó la ortografía y las tildes en toda la interfaz.</w:t>
+      </w:r>
+    </w:p>
+    <w:p>
+      <w:pPr>
+        <w:spacing w:after="120"/>
+      </w:pPr>
+      <w:r>
+        <w:t xml:space="preserve">Adicionalmente, se sumó valor a la entrega con: pantalla de inicio con conteos en vivo, diseño visual propio con Tailwind CSS, columna de cantidad de notas por Estudiante/Profesor, menú de acciones organizado, contenedores Docker para levantar todo el stack con un solo comando, pruebas unitarias del backend y linting automatizado en frontend y backend.</w:t>
       </w:r>
     </w:p>
     <w:p>
@@ -240,6 +264,19 @@
     </w:p>
     <w:p>
       <w:pPr>
+        <w:pStyle w:val="ListParagraph"/>
+        <w:numPr>
+          <w:ilvl w:val="0"/>
+          <w:numId w:val="1"/>
+        </w:numPr>
+        <w:spacing w:after="60"/>
+      </w:pPr>
+      <w:r>
+        <w:t xml:space="preserve">AudiSoft.Application.Tests: pruebas unitarias (xUnit + Moq) de las reglas de negocio.</w:t>
+      </w:r>
+    </w:p>
+    <w:p>
+      <w:pPr>
         <w:spacing w:after="120"/>
       </w:pPr>
       <w:r>
@@ -260,7 +297,7 @@
         <w:spacing w:after="120"/>
       </w:pPr>
       <w:r>
-        <w:t xml:space="preserve">Se usa SQL Server LocalDB con Entity Framework Core Code-First y migraciones. Las llaves foráneas de Nota (IdEstudiante, IdProfesor) usan DeleteBehavior.Restrict, y además la capa de aplicación valida explícitamente antes de eliminar un Estudiante o Profesor si existen Notas asociadas, devolviendo un error de negocio (HTTP 409) con un mensaje claro en vez de dejar que falle la base de datos con un error genérico.</w:t>
+        <w:t xml:space="preserve">Se usa SQL Server con Entity Framework Core Code-First y migraciones (LocalDB en desarrollo local, contenedor en Docker). Las llaves foráneas de Nota (IdEstudiante, IdProfesor) usan DeleteBehavior.Restrict, y además la capa de aplicación valida explícitamente antes de eliminar un Estudiante o Profesor si existen Notas asociadas, devolviendo un error de negocio (HTTP 409) con un mensaje claro en vez de dejar que falle la base de datos con un error genérico. Las migraciones se aplican automáticamente al arrancar el backend.</w:t>
       </w:r>
     </w:p>
     <w:p>
@@ -269,7 +306,7 @@
         <w:spacing w:after="120" w:before="250"/>
       </w:pPr>
       <w:r>
-        <w:t xml:space="preserve">2.3 Frontend — Angular + Angular Material + Tailwind CSS</w:t>
+        <w:t xml:space="preserve">2.3 Frontend — Angular + Angular Material + Tailwind CSS + SweetAlert2</w:t>
       </w:r>
     </w:p>
     <w:p>
@@ -277,59 +314,133 @@
         <w:spacing w:after="120"/>
       </w:pPr>
       <w:r>
-        <w:t xml:space="preserve">El frontend usa Angular en su versión más reciente (componentes standalone), Angular Material para los componentes funcionales (tabla, paginador, diálogos modales y mensajes tipo snackbar) y Tailwind CSS para la maquetación y estilos generales.</w:t>
-      </w:r>
-    </w:p>
-    <w:p>
-      <w:pPr>
-        <w:pStyle w:val="ListParagraph"/>
-        <w:numPr>
-          <w:ilvl w:val="0"/>
-          <w:numId w:val="1"/>
-        </w:numPr>
-        <w:spacing w:after="60"/>
-      </w:pPr>
-      <w:r>
-        <w:t xml:space="preserve">Tres páginas con ruteo lazy-loading: Estudiantes, Profesores y Notas.</w:t>
-      </w:r>
-    </w:p>
-    <w:p>
-      <w:pPr>
-        <w:pStyle w:val="ListParagraph"/>
-        <w:numPr>
-          <w:ilvl w:val="0"/>
-          <w:numId w:val="1"/>
-        </w:numPr>
-        <w:spacing w:after="60"/>
-      </w:pPr>
-      <w:r>
-        <w:t xml:space="preserve">Cada página muestra una tabla paginada (3 registros por página) con opciones de crear, editar y eliminar.</w:t>
-      </w:r>
-    </w:p>
-    <w:p>
-      <w:pPr>
-        <w:pStyle w:val="ListParagraph"/>
-        <w:numPr>
-          <w:ilvl w:val="0"/>
-          <w:numId w:val="1"/>
-        </w:numPr>
-        <w:spacing w:after="60"/>
-      </w:pPr>
-      <w:r>
-        <w:t xml:space="preserve">Un interceptor HTTP centraliza el manejo de errores del backend y los muestra como notificaciones.</w:t>
-      </w:r>
-    </w:p>
-    <w:p>
-      <w:pPr>
-        <w:pStyle w:val="ListParagraph"/>
-        <w:numPr>
-          <w:ilvl w:val="0"/>
-          <w:numId w:val="1"/>
-        </w:numPr>
-        <w:spacing w:after="60"/>
-      </w:pPr>
-      <w:r>
-        <w:t xml:space="preserve">Los mensajes de éxito ("se ha creado/actualizado/eliminado exitosamente") se muestran tras cada acción.</w:t>
+        <w:t xml:space="preserve">El frontend usa Angular en su versión más reciente (componentes standalone), Angular Material para los componentes funcionales (tabla, paginador, diálogos modales, menús), Tailwind CSS para un diseño visual propio, y SweetAlert2 para las alertas de éxito, error y confirmación.</w:t>
+      </w:r>
+    </w:p>
+    <w:p>
+      <w:pPr>
+        <w:pStyle w:val="ListParagraph"/>
+        <w:numPr>
+          <w:ilvl w:val="0"/>
+          <w:numId w:val="1"/>
+        </w:numPr>
+        <w:spacing w:after="60"/>
+      </w:pPr>
+      <w:r>
+        <w:t xml:space="preserve">Cuatro páginas con ruteo lazy-loading: Inicio, Estudiantes, Profesores y Notas.</w:t>
+      </w:r>
+    </w:p>
+    <w:p>
+      <w:pPr>
+        <w:pStyle w:val="ListParagraph"/>
+        <w:numPr>
+          <w:ilvl w:val="0"/>
+          <w:numId w:val="1"/>
+        </w:numPr>
+        <w:spacing w:after="60"/>
+      </w:pPr>
+      <w:r>
+        <w:t xml:space="preserve">Cada página de gestión muestra una tabla paginada (3 registros por página) con un menú de acciones (Editar/Eliminar) organizado.</w:t>
+      </w:r>
+    </w:p>
+    <w:p>
+      <w:pPr>
+        <w:pStyle w:val="ListParagraph"/>
+        <w:numPr>
+          <w:ilvl w:val="0"/>
+          <w:numId w:val="1"/>
+        </w:numPr>
+        <w:spacing w:after="60"/>
+      </w:pPr>
+      <w:r>
+        <w:t xml:space="preserve">Estudiantes y Profesores muestran la cantidad de Notas asociadas a cada registro.</w:t>
+      </w:r>
+    </w:p>
+    <w:p>
+      <w:pPr>
+        <w:pStyle w:val="ListParagraph"/>
+        <w:numPr>
+          <w:ilvl w:val="0"/>
+          <w:numId w:val="1"/>
+        </w:numPr>
+        <w:spacing w:after="60"/>
+      </w:pPr>
+      <w:r>
+        <w:t xml:space="preserve">Los formularios de Estudiante y Profesor capturan Nombres y Apellidos por separado, que se combinan en el campo Nombre único que exige el esquema de base de datos.</w:t>
+      </w:r>
+    </w:p>
+    <w:p>
+      <w:pPr>
+        <w:pStyle w:val="ListParagraph"/>
+        <w:numPr>
+          <w:ilvl w:val="0"/>
+          <w:numId w:val="1"/>
+        </w:numPr>
+        <w:spacing w:after="60"/>
+      </w:pPr>
+      <w:r>
+        <w:t xml:space="preserve">Un interceptor HTTP centraliza el manejo de errores del backend y dispara las alertas correspondientes.</w:t>
+      </w:r>
+    </w:p>
+    <w:p>
+      <w:pPr>
+        <w:pStyle w:val="Heading2"/>
+        <w:spacing w:after="120" w:before="250"/>
+      </w:pPr>
+      <w:r>
+        <w:t xml:space="preserve">2.4 Calidad de código y contenedores</w:t>
+      </w:r>
+    </w:p>
+    <w:p>
+      <w:pPr>
+        <w:pStyle w:val="ListParagraph"/>
+        <w:numPr>
+          <w:ilvl w:val="0"/>
+          <w:numId w:val="1"/>
+        </w:numPr>
+        <w:spacing w:after="60"/>
+      </w:pPr>
+      <w:r>
+        <w:t xml:space="preserve">ESLint (angular-eslint) en el frontend: 0 problemas (se corrigieron 11 hallazgos reales de accesibilidad durante el desarrollo).</w:t>
+      </w:r>
+    </w:p>
+    <w:p>
+      <w:pPr>
+        <w:pStyle w:val="ListParagraph"/>
+        <w:numPr>
+          <w:ilvl w:val="0"/>
+          <w:numId w:val="1"/>
+        </w:numPr>
+        <w:spacing w:after="60"/>
+      </w:pPr>
+      <w:r>
+        <w:t xml:space="preserve">Analizadores de .NET + dotnet format en el backend: 0 advertencias.</w:t>
+      </w:r>
+    </w:p>
+    <w:p>
+      <w:pPr>
+        <w:pStyle w:val="ListParagraph"/>
+        <w:numPr>
+          <w:ilvl w:val="0"/>
+          <w:numId w:val="1"/>
+        </w:numPr>
+        <w:spacing w:after="60"/>
+      </w:pPr>
+      <w:r>
+        <w:t xml:space="preserve">14 pruebas unitarias del backend en verde, cubriendo las reglas de negocio más sensibles.</w:t>
+      </w:r>
+    </w:p>
+    <w:p>
+      <w:pPr>
+        <w:pStyle w:val="ListParagraph"/>
+        <w:numPr>
+          <w:ilvl w:val="0"/>
+          <w:numId w:val="1"/>
+        </w:numPr>
+        <w:spacing w:after="60"/>
+      </w:pPr>
+      <w:r>
+        <w:t xml:space="preserve">Docker + Docker Compose: un solo comando (docker compose up --build) levanta SQL Server, backend y frontend en contenedores, sin instalar nada más que Docker Desktop.</w:t>
       </w:r>
     </w:p>
     <w:p>
@@ -343,6 +454,35 @@
     </w:p>
     <w:p>
       <w:pPr>
+        <w:spacing w:after="120"/>
+      </w:pPr>
+      <w:r>
+        <w:t xml:space="preserve">Opción recomendada — Docker:</w:t>
+      </w:r>
+    </w:p>
+    <w:p>
+      <w:pPr>
+        <w:pStyle w:val="ListParagraph"/>
+        <w:numPr>
+          <w:ilvl w:val="0"/>
+          <w:numId w:val="1"/>
+        </w:numPr>
+        <w:spacing w:after="60"/>
+      </w:pPr>
+      <w:r>
+        <w:t xml:space="preserve">Docker Desktop</w:t>
+      </w:r>
+    </w:p>
+    <w:p>
+      <w:pPr>
+        <w:spacing w:after="120"/>
+      </w:pPr>
+      <w:r>
+        <w:t xml:space="preserve">Opción local — sin Docker:</w:t>
+      </w:r>
+    </w:p>
+    <w:p>
+      <w:pPr>
         <w:pStyle w:val="ListParagraph"/>
         <w:numPr>
           <w:ilvl w:val="0"/>
@@ -391,19 +531,6 @@
       </w:pPr>
       <w:r>
         <w:t xml:space="preserve">Angular CLI (npm install -g @angular/cli)</w:t>
-      </w:r>
-    </w:p>
-    <w:p>
-      <w:pPr>
-        <w:pStyle w:val="ListParagraph"/>
-        <w:numPr>
-          <w:ilvl w:val="0"/>
-          <w:numId w:val="1"/>
-        </w:numPr>
-        <w:spacing w:after="60"/>
-      </w:pPr>
-      <w:r>
-        <w:t xml:space="preserve">Herramienta dotnet-ef (dotnet tool install --global dotnet-ef)</w:t>
       </w:r>
     </w:p>
     <w:p>
@@ -412,7 +539,7 @@
         <w:spacing w:after="150" w:before="300"/>
       </w:pPr>
       <w:r>
-        <w:t xml:space="preserve">4. Instalación y ejecución del Backend</w:t>
+        <w:t xml:space="preserve">4. Instalación y ejecución — Opción A: Docker (recomendada)</w:t>
       </w:r>
     </w:p>
     <w:p>
@@ -420,7 +547,7 @@
         <w:spacing w:after="120"/>
       </w:pPr>
       <w:r>
-        <w:t xml:space="preserve">Desde la carpeta backend/ del proyecto:</w:t>
+        <w:t xml:space="preserve">Desde la raíz del proyecto:</w:t>
       </w:r>
     </w:p>
     <w:p>
@@ -435,7 +562,58 @@
           <w:sz w:val="20"/>
           <w:szCs w:val="20"/>
         </w:rPr>
-        <w:t xml:space="preserve">dotnet restore</w:t>
+        <w:t xml:space="preserve">docker compose up --build</w:t>
+      </w:r>
+    </w:p>
+    <w:p>
+      <w:pPr>
+        <w:spacing w:after="120"/>
+      </w:pPr>
+      <w:r>
+        <w:t xml:space="preserve">La primera vez tarda entre 5 y 10 minutos (descarga las imágenes base de SQL Server y del SDK de .NET, y compila ambos proyectos). Las siguientes veces es mucho más rápido. Levanta 3 contenedores: SQL Server, backend (aplica las migraciones automáticamente) y frontend (servido con nginx).</w:t>
+      </w:r>
+    </w:p>
+    <w:p>
+      <w:pPr>
+        <w:pStyle w:val="ListParagraph"/>
+        <w:numPr>
+          <w:ilvl w:val="0"/>
+          <w:numId w:val="1"/>
+        </w:numPr>
+        <w:spacing w:after="60"/>
+      </w:pPr>
+      <w:r>
+        <w:t xml:space="preserve">Frontend: http://localhost:4200</w:t>
+      </w:r>
+    </w:p>
+    <w:p>
+      <w:pPr>
+        <w:pStyle w:val="ListParagraph"/>
+        <w:numPr>
+          <w:ilvl w:val="0"/>
+          <w:numId w:val="1"/>
+        </w:numPr>
+        <w:spacing w:after="60"/>
+      </w:pPr>
+      <w:r>
+        <w:t xml:space="preserve">Backend / Swagger: http://localhost:5080/swagger</w:t>
+      </w:r>
+    </w:p>
+    <w:p>
+      <w:pPr>
+        <w:pStyle w:val="Heading1"/>
+        <w:spacing w:after="150" w:before="300"/>
+      </w:pPr>
+      <w:r>
+        <w:t xml:space="preserve">5. Instalación y ejecución — Opción B: Local (sin Docker)</w:t>
+      </w:r>
+    </w:p>
+    <w:p>
+      <w:pPr>
+        <w:spacing w:after="120"/>
+      </w:pPr>
+      <w:r>
+        <w:t xml:space="preserve">Backend, desde la carpeta backend/:</w:t>
       </w:r>
     </w:p>
     <w:p>
@@ -450,7 +628,7 @@
           <w:sz w:val="20"/>
           <w:szCs w:val="20"/>
         </w:rPr>
-        <w:t xml:space="preserve">dotnet ef database update --project src/AudiSoft.Infrastructure --startup-project src/AudiSoft.WebApi</w:t>
+        <w:t xml:space="preserve">dotnet restore</w:t>
       </w:r>
     </w:p>
     <w:p>
@@ -473,16 +651,7 @@
         <w:spacing w:after="120"/>
       </w:pPr>
       <w:r>
-        <w:t xml:space="preserve">El comando anterior crea la base de datos AudiSoftDb en LocalDB (si no existe) con las tablas, restricciones de llave foránea y los 5 registros de ejemplo (seed data) por cada tabla. El API queda disponible en http://localhost:5080 y la documentación interactiva de Swagger en http://localhost:5080/swagger, recomendada para probar el API con una herramienta tipo Postman.</w:t>
-      </w:r>
-    </w:p>
-    <w:p>
-      <w:pPr>
-        <w:pStyle w:val="Heading1"/>
-        <w:spacing w:after="150" w:before="300"/>
-      </w:pPr>
-      <w:r>
-        <w:t xml:space="preserve">5. Instalación y ejecución del Frontend</w:t>
+        <w:t xml:space="preserve">La base de datos y las migraciones se aplican automáticamente al arrancar (no hace falta correr comandos adicionales). API en http://localhost:5080, Swagger en http://localhost:5080/swagger, recomendado para probar el API con una herramienta tipo Postman.</w:t>
       </w:r>
     </w:p>
     <w:p>
@@ -490,7 +659,7 @@
         <w:spacing w:after="120"/>
       </w:pPr>
       <w:r>
-        <w:t xml:space="preserve">Desde la carpeta frontend/ del proyecto:</w:t>
+        <w:t xml:space="preserve">Frontend, desde la carpeta frontend/:</w:t>
       </w:r>
     </w:p>
     <w:p>
@@ -528,7 +697,7 @@
         <w:spacing w:after="120"/>
       </w:pPr>
       <w:r>
-        <w:t xml:space="preserve">La aplicación queda disponible en http://localhost:4200. El backend debe estar corriendo previamente para que el frontend pueda consumir el API (CORS ya está configurado para http://localhost:4200).</w:t>
+        <w:t xml:space="preserve">Aplicación disponible en http://localhost:4200.</w:t>
       </w:r>
     </w:p>
     <w:p>
@@ -545,7 +714,7 @@
         <w:spacing w:after="120"/>
       </w:pPr>
       <w:r>
-        <w:t xml:space="preserve">El script SQL de creación de la base de datos (generado a partir de las migraciones de Entity Framework Core) se encuentra en entregables/script_base_datos.sql, incluido en la carpeta comprimida del proyecto.</w:t>
+        <w:t xml:space="preserve">El script SQL de creación de la base de datos (generado a partir de las migraciones de Entity Framework Core, en formato idempotente) se encuentra en entregables/script_base_datos.sql, incluido en la carpeta comprimida del proyecto.</w:t>
       </w:r>
     </w:p>
     <w:p>
@@ -563,7 +732,7 @@
         <w:spacing w:after="120" w:before="250"/>
       </w:pPr>
       <w:r>
-        <w:t xml:space="preserve">7.1 Gestión de Estudiantes</w:t>
+        <w:t xml:space="preserve">7.1 Pantalla de inicio</w:t>
       </w:r>
     </w:p>
     <w:p>
@@ -625,7 +794,12 @@
           <w:sz w:val="20"/>
           <w:szCs w:val="20"/>
         </w:rPr>
-        <w:t xml:space="preserve">Listado de Estudiantes con paginación (5 registros de ejemplo, 3 por página).</w:t>
+        <w:t xml:space="preserve">Pantalla de inicio con acceso a las 3 secciones y conteo de registros en vivo.</w:t>
+      </w:r>
+    </w:p>
+    <w:p>
+      <w:r>
+        <w:br w:type="page"/>
       </w:r>
     </w:p>
     <w:p>
@@ -634,7 +808,7 @@
         <w:spacing w:after="120" w:before="250"/>
       </w:pPr>
       <w:r>
-        <w:t xml:space="preserve">7.2 Gestión de Profesores</w:t>
+        <w:t xml:space="preserve">7.2 Gestión de Estudiantes</w:t>
       </w:r>
     </w:p>
     <w:p>
@@ -696,7 +870,7 @@
           <w:sz w:val="20"/>
           <w:szCs w:val="20"/>
         </w:rPr>
-        <w:t xml:space="preserve">Listado de Profesores con paginación.</w:t>
+        <w:t xml:space="preserve">Listado de Estudiantes con paginación, columna de cantidad de notas y menú de acciones (5 registros de ejemplo, 3 por página).</w:t>
       </w:r>
     </w:p>
     <w:p>
@@ -705,7 +879,7 @@
         <w:spacing w:after="120" w:before="250"/>
       </w:pPr>
       <w:r>
-        <w:t xml:space="preserve">7.3 Gestión de Notas</w:t>
+        <w:t xml:space="preserve">7.3 Gestión de Profesores</w:t>
       </w:r>
     </w:p>
     <w:p>
@@ -767,7 +941,7 @@
           <w:sz w:val="20"/>
           <w:szCs w:val="20"/>
         </w:rPr>
-        <w:t xml:space="preserve">Listado de Notas con los nombres de Estudiante y Profesor asociados.</w:t>
+        <w:t xml:space="preserve">Listado de Profesores con paginación y cantidad de notas asignadas.</w:t>
       </w:r>
     </w:p>
     <w:p>
@@ -781,7 +955,7 @@
         <w:spacing w:after="120" w:before="250"/>
       </w:pPr>
       <w:r>
-        <w:t xml:space="preserve">7.4 Creación de un registro</w:t>
+        <w:t xml:space="preserve">7.4 Gestión de Notas</w:t>
       </w:r>
     </w:p>
     <w:p>
@@ -843,7 +1017,7 @@
           <w:sz w:val="20"/>
           <w:szCs w:val="20"/>
         </w:rPr>
-        <w:t xml:space="preserve">Diálogo modal de creación de un Estudiante, con validación de campos requeridos.</w:t>
+        <w:t xml:space="preserve">Listado de Notas con los nombres de Estudiante y Profesor asociados, y estado Aprobado/Reprobado según el valor.</w:t>
       </w:r>
     </w:p>
     <w:p>
@@ -852,7 +1026,7 @@
         <w:spacing w:after="120" w:before="250"/>
       </w:pPr>
       <w:r>
-        <w:t xml:space="preserve">7.5 Confirmación antes de eliminar</w:t>
+        <w:t xml:space="preserve">7.5 Creación de un registro</w:t>
       </w:r>
     </w:p>
     <w:p>
@@ -914,7 +1088,12 @@
           <w:sz w:val="20"/>
           <w:szCs w:val="20"/>
         </w:rPr>
-        <w:t xml:space="preserve">Diálogo de confirmación mostrado antes de eliminar cualquier registro.</w:t>
+        <w:t xml:space="preserve">Diálogo de creación de un Estudiante, con Nombres y Apellidos por separado y validación de campos requeridos.</w:t>
+      </w:r>
+    </w:p>
+    <w:p>
+      <w:r>
+        <w:br w:type="page"/>
       </w:r>
     </w:p>
     <w:p>
@@ -923,7 +1102,7 @@
         <w:spacing w:after="120" w:before="250"/>
       </w:pPr>
       <w:r>
-        <w:t xml:space="preserve">7.6 Bloqueo de eliminación por integridad referencial</w:t>
+        <w:t xml:space="preserve">7.6 Confirmación antes de eliminar</w:t>
       </w:r>
     </w:p>
     <w:p>
@@ -985,12 +1164,7 @@
           <w:sz w:val="20"/>
           <w:szCs w:val="20"/>
         </w:rPr>
-        <w:t xml:space="preserve">Al intentar eliminar un Estudiante con una Nota asociada, se muestra una alerta clara en vez de un error técnico: "No se puede eliminar el estudiante porque tiene notas asociadas."</w:t>
-      </w:r>
-    </w:p>
-    <w:p>
-      <w:r>
-        <w:br w:type="page"/>
+        <w:t xml:space="preserve">Confirmación con SweetAlert2 mostrada antes de eliminar cualquier registro.</w:t>
       </w:r>
     </w:p>
     <w:p>
@@ -999,7 +1173,7 @@
         <w:spacing w:after="120" w:before="250"/>
       </w:pPr>
       <w:r>
-        <w:t xml:space="preserve">7.7 Documentación interactiva del API (Swagger)</w:t>
+        <w:t xml:space="preserve">7.7 Bloqueo de eliminación por integridad referencial</w:t>
       </w:r>
     </w:p>
     <w:p>
@@ -1061,6 +1235,82 @@
           <w:sz w:val="20"/>
           <w:szCs w:val="20"/>
         </w:rPr>
+        <w:t xml:space="preserve">Al intentar eliminar un Estudiante con una Nota asociada, se muestra una alerta clara en vez de un error técnico: "No se puede eliminar el estudiante porque tiene notas asociadas."</w:t>
+      </w:r>
+    </w:p>
+    <w:p>
+      <w:r>
+        <w:br w:type="page"/>
+      </w:r>
+    </w:p>
+    <w:p>
+      <w:pPr>
+        <w:pStyle w:val="Heading2"/>
+        <w:spacing w:after="120" w:before="250"/>
+      </w:pPr>
+      <w:r>
+        <w:t xml:space="preserve">7.8 Documentación interactiva del API (Swagger)</w:t>
+      </w:r>
+    </w:p>
+    <w:p>
+      <w:pPr>
+        <w:spacing w:after="60" w:before="120"/>
+        <w:jc w:val="center"/>
+      </w:pPr>
+      <w:r>
+        <w:drawing>
+          <wp:inline distT="0" distB="0" distL="0" distR="0">
+            <wp:extent cx="5715000" cy="3095625"/>
+            <wp:effectExtent t="0" r="0" b="0" l="0"/>
+            <wp:docPr id="1" name="" descr="" title=""/>
+            <wp:cNvGraphicFramePr>
+              <a:graphicFrameLocks xmlns:a="http://schemas.openxmlformats.org/drawingml/2006/main" noChangeAspect="1"/>
+            </wp:cNvGraphicFramePr>
+            <a:graphic xmlns:a="http://schemas.openxmlformats.org/drawingml/2006/main">
+              <a:graphicData uri="http://schemas.openxmlformats.org/drawingml/2006/picture">
+                <pic:pic xmlns:pic="http://schemas.openxmlformats.org/drawingml/2006/picture">
+                  <pic:nvPicPr>
+                    <pic:cNvPr id="0" name="" descr=""/>
+                    <pic:cNvPicPr>
+                      <a:picLocks noChangeAspect="1" noChangeArrowheads="1"/>
+                    </pic:cNvPicPr>
+                  </pic:nvPicPr>
+                  <pic:blipFill>
+                    <a:blip r:embed="rId14" cstate="none"/>
+                    <a:srcRect/>
+                    <a:stretch>
+                      <a:fillRect/>
+                    </a:stretch>
+                  </pic:blipFill>
+                  <pic:spPr bwMode="auto">
+                    <a:xfrm>
+                      <a:off x="0" y="0"/>
+                      <a:ext cx="5715000" cy="3095625"/>
+                    </a:xfrm>
+                    <a:prstGeom prst="rect">
+                      <a:avLst/>
+                    </a:prstGeom>
+                  </pic:spPr>
+                </pic:pic>
+              </a:graphicData>
+            </a:graphic>
+          </wp:inline>
+        </w:drawing>
+      </w:r>
+    </w:p>
+    <w:p>
+      <w:pPr>
+        <w:spacing w:after="300"/>
+        <w:jc w:val="center"/>
+      </w:pPr>
+      <w:r>
+        <w:rPr>
+          <w:i/>
+          <w:iCs/>
+          <w:color w:val="555555"/>
+          <w:sz w:val="20"/>
+          <w:szCs w:val="20"/>
+        </w:rPr>
         <w:t xml:space="preserve">Swagger UI exponiendo los endpoints REST de Estudiantes, Profesores y Notas, recomendado para pruebas con Postman.</w:t>
       </w:r>
     </w:p>
@@ -1109,7 +1359,20 @@
         <w:spacing w:after="60"/>
       </w:pPr>
       <w:r>
-        <w:t xml:space="preserve">Mensajes de éxito y error: unificados mediante un interceptor HTTP en el frontend y un middleware de manejo de errores en el backend (formato ProblemDetails).</w:t>
+        <w:t xml:space="preserve">Nombres y Apellidos: el formulario los captura por separado y los concatena en un único campo Nombre al guardar, respetando el esquema de base de datos (id, nombre) exigido por la prueba.</w:t>
+      </w:r>
+    </w:p>
+    <w:p>
+      <w:pPr>
+        <w:pStyle w:val="ListParagraph"/>
+        <w:numPr>
+          <w:ilvl w:val="0"/>
+          <w:numId w:val="1"/>
+        </w:numPr>
+        <w:spacing w:after="60"/>
+      </w:pPr>
+      <w:r>
+        <w:t xml:space="preserve">Mensajes de éxito y error: unificados mediante un interceptor HTTP en el frontend (SweetAlert2) y un middleware de manejo de errores en el backend (formato ProblemDetails).</w:t>
       </w:r>
     </w:p>
     <w:p>
@@ -1123,6 +1386,19 @@
       </w:pPr>
       <w:r>
         <w:t xml:space="preserve">Seed data: 5 Estudiantes, 5 Profesores y 5 Notas creados mediante migración de Entity Framework Core, reproducibles en cualquier entorno.</w:t>
+      </w:r>
+    </w:p>
+    <w:p>
+      <w:pPr>
+        <w:pStyle w:val="ListParagraph"/>
+        <w:numPr>
+          <w:ilvl w:val="0"/>
+          <w:numId w:val="1"/>
+        </w:numPr>
+        <w:spacing w:after="60"/>
+      </w:pPr>
+      <w:r>
+        <w:t xml:space="preserve">Sin autenticación: no fue solicitada por el PDF ni por las recomendaciones adicionales, por lo que se priorizó completar y pulir los requisitos explícitos dentro del plazo.</w:t>
       </w:r>
     </w:p>
     <w:p>

</xml_diff>

<commit_message>
Docs: reflejar la seccion de rendimiento academico del home
Actualiza README, coleccion de Postman, captura y documento de
instalacion con el nuevo endpoint /api/estadisticas y la tarjeta
de rendimiento academico en el home.
</commit_message>
<xml_diff>
--- a/entregables/Documento_Instalacion.docx
+++ b/entregables/Documento_Instalacion.docx
@@ -181,7 +181,7 @@
         <w:spacing w:after="120"/>
       </w:pPr>
       <w:r>
-        <w:t xml:space="preserve">Adicionalmente, se sumó valor a la entrega con: autenticación JWT en toda la aplicación y el API, pantalla de inicio con conteos en vivo, diseño visual propio con Tailwind CSS, columna de cantidad de notas por Estudiante/Profesor, menú de acciones organizado, contenedores Docker para levantar todo el stack con un solo comando, pruebas unitarias del backend, integración continua con GitHub Actions y linting automatizado en frontend y backend.</w:t>
+        <w:t xml:space="preserve">Adicionalmente, se sumó valor a la entrega con: autenticación JWT en toda la aplicación y el API, pantalla de inicio con conteos en vivo y estadísticas de rendimiento académico (promedio general y porcentaje de estudiantes aprobados/reprobados), diseño visual propio con Tailwind CSS, columna de cantidad de notas por Estudiante/Profesor, menú de acciones organizado, contenedores Docker para levantar todo el stack con un solo comando, pruebas unitarias del backend, integración continua con GitHub Actions y linting automatizado en frontend y backend.</w:t>
       </w:r>
     </w:p>
     <w:p>
@@ -444,7 +444,7 @@
         <w:spacing w:after="60"/>
       </w:pPr>
       <w:r>
-        <w:t xml:space="preserve">14 pruebas unitarias del backend en verde, cubriendo las reglas de negocio más sensibles.</w:t>
+        <w:t xml:space="preserve">19 pruebas unitarias del backend en verde, cubriendo las reglas de negocio más sensibles.</w:t>
       </w:r>
     </w:p>
     <w:p>
@@ -930,7 +930,7 @@
           <w:sz w:val="20"/>
           <w:szCs w:val="20"/>
         </w:rPr>
-        <w:t xml:space="preserve">Pantalla de inicio (usuario autenticado) con acceso a las 3 secciones y conteo de registros en vivo.</w:t>
+        <w:t xml:space="preserve">Pantalla de inicio (usuario autenticado) con acceso a las 3 secciones, conteo de registros en vivo y tarjeta de rendimiento académico (promedio general y porcentaje de estudiantes aprobados/reprobados).</w:t>
       </w:r>
     </w:p>
     <w:p>
@@ -1530,6 +1530,19 @@
       </w:pPr>
       <w:r>
         <w:t xml:space="preserve">Autenticación JWT con un único usuario de ejemplo sembrado por migración; suficiente para demostrar el flujo de login, protección de rutas/endpoints y manejo de sesión sin necesitar un módulo completo de gestión de usuarios.</w:t>
+      </w:r>
+    </w:p>
+    <w:p>
+      <w:pPr>
+        <w:pStyle w:val="ListParagraph"/>
+        <w:numPr>
+          <w:ilvl w:val="0"/>
+          <w:numId w:val="1"/>
+        </w:numPr>
+        <w:spacing w:after="60"/>
+      </w:pPr>
+      <w:r>
+        <w:t xml:space="preserve">Rendimiento académico: un estudiante se considera aprobado si el promedio de sus Notas es de 3.0 o más; el endpoint GET /api/estadisticas calcula estos indicadores en el servidor a partir de los datos actuales.</w:t>
       </w:r>
     </w:p>
     <w:p>

</xml_diff>

<commit_message>
Docs: reflejar el filtro de Notas por estudiante y profesor
Actualiza README, coleccion de Postman, capturas y documento de
instalacion con los nuevos filtros del listado de Notas.
</commit_message>
<xml_diff>
--- a/entregables/Documento_Instalacion.docx
+++ b/entregables/Documento_Instalacion.docx
@@ -341,6 +341,19 @@
       </w:pPr>
       <w:r>
         <w:t xml:space="preserve">Cada página de gestión muestra una tabla paginada (3 registros por página) con un menú de acciones (Editar/Eliminar) organizado.</w:t>
+      </w:r>
+    </w:p>
+    <w:p>
+      <w:pPr>
+        <w:pStyle w:val="ListParagraph"/>
+        <w:numPr>
+          <w:ilvl w:val="0"/>
+          <w:numId w:val="1"/>
+        </w:numPr>
+        <w:spacing w:after="60"/>
+      </w:pPr>
+      <w:r>
+        <w:t xml:space="preserve">El listado de Notas incluye filtros por Estudiante y por Profesor, para consultar de una vez todas las calificaciones de una persona.</w:t>
       </w:r>
     </w:p>
     <w:p>
@@ -1148,7 +1161,7 @@
           <w:sz w:val="20"/>
           <w:szCs w:val="20"/>
         </w:rPr>
-        <w:t xml:space="preserve">Listado de Notas con los nombres de Estudiante y Profesor asociados, y estado Aprobado/Reprobado según el valor.</w:t>
+        <w:t xml:space="preserve">Listado de Notas con los nombres de Estudiante y Profesor asociados, y estado Aprobado/Reprobado según el valor. Incluye filtros por Estudiante y por Profesor.</w:t>
       </w:r>
     </w:p>
     <w:p>
@@ -1162,7 +1175,7 @@
         <w:spacing w:after="120" w:before="250"/>
       </w:pPr>
       <w:r>
-        <w:t xml:space="preserve">8.6 Creación de un registro</w:t>
+        <w:t xml:space="preserve">8.6 Filtro de Notas por estudiante</w:t>
       </w:r>
     </w:p>
     <w:p>
@@ -1224,7 +1237,12 @@
           <w:sz w:val="20"/>
           <w:szCs w:val="20"/>
         </w:rPr>
-        <w:t xml:space="preserve">Diálogo de creación de un Estudiante, con Nombres y Apellidos por separado y validación de campos requeridos.</w:t>
+        <w:t xml:space="preserve">Al filtrar por un Estudiante (o un Profesor), la tabla muestra únicamente las notas correspondientes; un botón "Limpiar filtros" permite volver al listado completo.</w:t>
+      </w:r>
+    </w:p>
+    <w:p>
+      <w:r>
+        <w:br w:type="page"/>
       </w:r>
     </w:p>
     <w:p>
@@ -1233,7 +1251,7 @@
         <w:spacing w:after="120" w:before="250"/>
       </w:pPr>
       <w:r>
-        <w:t xml:space="preserve">8.7 Confirmación antes de eliminar</w:t>
+        <w:t xml:space="preserve">8.7 Creación de un registro</w:t>
       </w:r>
     </w:p>
     <w:p>
@@ -1295,12 +1313,7 @@
           <w:sz w:val="20"/>
           <w:szCs w:val="20"/>
         </w:rPr>
-        <w:t xml:space="preserve">Confirmación con SweetAlert2 mostrada antes de eliminar cualquier registro.</w:t>
-      </w:r>
-    </w:p>
-    <w:p>
-      <w:r>
-        <w:br w:type="page"/>
+        <w:t xml:space="preserve">Diálogo de creación de un Estudiante, con Nombres y Apellidos por separado y validación de campos requeridos.</w:t>
       </w:r>
     </w:p>
     <w:p>
@@ -1309,7 +1322,7 @@
         <w:spacing w:after="120" w:before="250"/>
       </w:pPr>
       <w:r>
-        <w:t xml:space="preserve">8.8 Bloqueo de eliminación por integridad referencial</w:t>
+        <w:t xml:space="preserve">8.8 Confirmación antes de eliminar</w:t>
       </w:r>
     </w:p>
     <w:p>
@@ -1371,7 +1384,12 @@
           <w:sz w:val="20"/>
           <w:szCs w:val="20"/>
         </w:rPr>
-        <w:t xml:space="preserve">Al intentar eliminar un Estudiante con una Nota asociada, se muestra una alerta clara en vez de un error técnico: "No se puede eliminar el estudiante porque tiene notas asociadas."</w:t>
+        <w:t xml:space="preserve">Confirmación con SweetAlert2 mostrada antes de eliminar cualquier registro.</w:t>
+      </w:r>
+    </w:p>
+    <w:p>
+      <w:r>
+        <w:br w:type="page"/>
       </w:r>
     </w:p>
     <w:p>
@@ -1380,7 +1398,7 @@
         <w:spacing w:after="120" w:before="250"/>
       </w:pPr>
       <w:r>
-        <w:t xml:space="preserve">8.9 Documentación interactiva del API (Swagger)</w:t>
+        <w:t xml:space="preserve">8.9 Bloqueo de eliminación por integridad referencial</w:t>
       </w:r>
     </w:p>
     <w:p>
@@ -1442,6 +1460,77 @@
           <w:sz w:val="20"/>
           <w:szCs w:val="20"/>
         </w:rPr>
+        <w:t xml:space="preserve">Al intentar eliminar un Estudiante con una Nota asociada, se muestra una alerta clara en vez de un error técnico: "No se puede eliminar el estudiante porque tiene notas asociadas."</w:t>
+      </w:r>
+    </w:p>
+    <w:p>
+      <w:pPr>
+        <w:pStyle w:val="Heading2"/>
+        <w:spacing w:after="120" w:before="250"/>
+      </w:pPr>
+      <w:r>
+        <w:t xml:space="preserve">8.10 Documentación interactiva del API (Swagger)</w:t>
+      </w:r>
+    </w:p>
+    <w:p>
+      <w:pPr>
+        <w:spacing w:after="60" w:before="120"/>
+        <w:jc w:val="center"/>
+      </w:pPr>
+      <w:r>
+        <w:drawing>
+          <wp:inline distT="0" distB="0" distL="0" distR="0">
+            <wp:extent cx="5715000" cy="3095625"/>
+            <wp:effectExtent t="0" r="0" b="0" l="0"/>
+            <wp:docPr id="1" name="" descr="" title=""/>
+            <wp:cNvGraphicFramePr>
+              <a:graphicFrameLocks xmlns:a="http://schemas.openxmlformats.org/drawingml/2006/main" noChangeAspect="1"/>
+            </wp:cNvGraphicFramePr>
+            <a:graphic xmlns:a="http://schemas.openxmlformats.org/drawingml/2006/main">
+              <a:graphicData uri="http://schemas.openxmlformats.org/drawingml/2006/picture">
+                <pic:pic xmlns:pic="http://schemas.openxmlformats.org/drawingml/2006/picture">
+                  <pic:nvPicPr>
+                    <pic:cNvPr id="0" name="" descr=""/>
+                    <pic:cNvPicPr>
+                      <a:picLocks noChangeAspect="1" noChangeArrowheads="1"/>
+                    </pic:cNvPicPr>
+                  </pic:nvPicPr>
+                  <pic:blipFill>
+                    <a:blip r:embed="rId16" cstate="none"/>
+                    <a:srcRect/>
+                    <a:stretch>
+                      <a:fillRect/>
+                    </a:stretch>
+                  </pic:blipFill>
+                  <pic:spPr bwMode="auto">
+                    <a:xfrm>
+                      <a:off x="0" y="0"/>
+                      <a:ext cx="5715000" cy="3095625"/>
+                    </a:xfrm>
+                    <a:prstGeom prst="rect">
+                      <a:avLst/>
+                    </a:prstGeom>
+                  </pic:spPr>
+                </pic:pic>
+              </a:graphicData>
+            </a:graphic>
+          </wp:inline>
+        </w:drawing>
+      </w:r>
+    </w:p>
+    <w:p>
+      <w:pPr>
+        <w:spacing w:after="300"/>
+        <w:jc w:val="center"/>
+      </w:pPr>
+      <w:r>
+        <w:rPr>
+          <w:i/>
+          <w:iCs/>
+          <w:color w:val="555555"/>
+          <w:sz w:val="20"/>
+          <w:szCs w:val="20"/>
+        </w:rPr>
         <w:t xml:space="preserve">Swagger UI exponiendo los endpoints REST de Estudiantes, Profesores, Notas y autenticación, recomendado para pruebas con Postman.</w:t>
       </w:r>
     </w:p>
@@ -1543,6 +1632,19 @@
       </w:pPr>
       <w:r>
         <w:t xml:space="preserve">Rendimiento académico: un estudiante se considera aprobado si el promedio de sus Notas es de 3.0 o más; el endpoint GET /api/estadisticas calcula estos indicadores en el servidor a partir de los datos actuales.</w:t>
+      </w:r>
+    </w:p>
+    <w:p>
+      <w:pPr>
+        <w:pStyle w:val="ListParagraph"/>
+        <w:numPr>
+          <w:ilvl w:val="0"/>
+          <w:numId w:val="1"/>
+        </w:numPr>
+        <w:spacing w:after="60"/>
+      </w:pPr>
+      <w:r>
+        <w:t xml:space="preserve">Filtro de Notas: idEstudiante e idProfesor son parámetros opcionales del mismo endpoint paginado GET /api/notas, para no duplicar rutas ni lógica de negocio.</w:t>
       </w:r>
     </w:p>
     <w:p>

</xml_diff>